<commit_message>
Use black and white report style
</commit_message>
<xml_diff>
--- a/Отчет_ПЗ2_Telco_Churn.docx
+++ b/Отчет_ПЗ2_Telco_Churn.docx
@@ -4,75 +4,79 @@
   <w:body>
     <w:p>
       <w:pPr>
-        <w:spacing w:after="120"/>
+        <w:pStyle w:val="Title"/>
+        <w:spacing w:line="360" w:lineRule="auto" w:before="0" w:after="120"/>
         <w:jc w:val="center"/>
       </w:pPr>
       <w:r>
         <w:rPr>
-          <w:rFonts w:ascii="Arial" w:hAnsi="Arial" w:cs="Arial"/>
+          <w:rFonts w:ascii="Times New Roman" w:hAnsi="Times New Roman" w:cs="Times New Roman" w:eastAsia="Times New Roman"/>
           <w:b/>
           <w:color w:val="000000"/>
-          <w:sz w:val="34"/>
+          <w:sz w:val="24"/>
         </w:rPr>
         <w:t>Отчёт по практическому занятию 2</w:t>
       </w:r>
     </w:p>
     <w:p>
       <w:pPr>
-        <w:spacing w:after="280"/>
+        <w:spacing w:line="360" w:lineRule="auto" w:before="0" w:after="240"/>
         <w:jc w:val="center"/>
       </w:pPr>
       <w:r>
         <w:rPr>
-          <w:rFonts w:ascii="Arial" w:hAnsi="Arial" w:cs="Arial"/>
+          <w:rFonts w:ascii="Times New Roman" w:hAnsi="Times New Roman" w:cs="Times New Roman" w:eastAsia="Times New Roman"/>
           <w:b w:val="0"/>
           <w:color w:val="000000"/>
-          <w:sz w:val="22"/>
+          <w:sz w:val="24"/>
         </w:rPr>
         <w:t>Прогнозирование оттока клиентов телеком оператора</w:t>
       </w:r>
     </w:p>
     <w:p>
       <w:pPr>
-        <w:spacing w:after="120" w:line="264" w:lineRule="auto"/>
+        <w:spacing w:line="360" w:lineRule="auto" w:before="0" w:after="120"/>
+        <w:jc w:val="left"/>
       </w:pPr>
       <w:r>
         <w:rPr>
-          <w:rFonts w:ascii="Arial" w:hAnsi="Arial" w:cs="Arial"/>
+          <w:rFonts w:ascii="Times New Roman" w:hAnsi="Times New Roman" w:cs="Times New Roman" w:eastAsia="Times New Roman"/>
           <w:b w:val="0"/>
           <w:color w:val="000000"/>
-          <w:sz w:val="21"/>
+          <w:sz w:val="24"/>
         </w:rPr>
-        <w:t>Датасет Telco Customer Churn: 7043 клиента. Целевая переменная - Churn. Доля ушедших клиентов - 26.5%.</w:t>
+        <w:t>Использован датасет Telco Customer Churn: 7 043 клиента. Целевая переменная - Churn, доля ушедших клиентов - 26,5%.</w:t>
       </w:r>
     </w:p>
     <w:p>
       <w:pPr>
         <w:keepNext/>
-        <w:spacing w:before="200" w:after="80"/>
+        <w:spacing w:line="360" w:lineRule="auto" w:before="200" w:after="60"/>
+        <w:jc w:val="left"/>
       </w:pPr>
       <w:r>
         <w:rPr>
-          <w:rFonts w:ascii="Arial" w:hAnsi="Arial" w:cs="Arial"/>
+          <w:rFonts w:ascii="Times New Roman" w:hAnsi="Times New Roman" w:cs="Times New Roman" w:eastAsia="Times New Roman"/>
           <w:b/>
           <w:color w:val="000000"/>
-          <w:sz w:val="26"/>
+          <w:sz w:val="24"/>
         </w:rPr>
-        <w:t>Подготовка и CatBoost</w:t>
+        <w:t>Подготовка данных и CatBoost</w:t>
       </w:r>
     </w:p>
     <w:p>
       <w:pPr>
-        <w:spacing w:after="120" w:line="264" w:lineRule="auto"/>
+        <w:spacing w:line="360" w:lineRule="auto" w:before="0" w:after="120"/>
+        <w:jc w:val="left"/>
       </w:pPr>
       <w:r>
         <w:rPr>
-          <w:rFonts w:ascii="Arial" w:hAnsi="Arial" w:cs="Arial"/>
+          <w:rFonts w:ascii="Times New Roman" w:hAnsi="Times New Roman" w:cs="Times New Roman" w:eastAsia="Times New Roman"/>
           <w:b w:val="0"/>
           <w:color w:val="000000"/>
-          <w:sz w:val="21"/>
+          <w:sz w:val="24"/>
         </w:rPr>
-        <w:t>Удалён customerID, TotalCharges приведён к числу. Данные разделены 80/20 с stratify=y. В Pipeline: StandardScaler для численных признаков, OneHotEncoder для категориальных и CatBoostClassifier.</w:t>
+        <w:t>Удалён customerID, TotalCharges приведён к числовому виду. Данные разделены в пропорции 80/20 с stratify=y. В Pipeline включены StandardScaler для численных признаков, OneHotEncoder для категориальных и CatBoostClassifier.</w:t>
       </w:r>
     </w:p>
     <w:tbl>
@@ -92,8 +96,9 @@
         </w:trPr>
         <w:tc>
           <w:tcPr>
-            <w:tcW w:type="dxa" w:w="3600"/>
+            <w:tcW w:type="dxa" w:w="3744"/>
             <w:vAlign w:val="center"/>
+            <w:shd w:val="clear" w:color="auto" w:fill="FFFFFF"/>
             <w:tcBorders>
               <w:top w:val="single" w:sz="8" w:space="0" w:color="000000"/>
               <w:left w:val="single" w:sz="8" w:space="0" w:color="000000"/>
@@ -103,22 +108,23 @@
               <w:insideV w:val="single" w:sz="8" w:space="0" w:color="000000"/>
             </w:tcBorders>
             <w:tcMar>
-              <w:top w:w="70" w:type="dxa"/>
-              <w:start w:w="95" w:type="dxa"/>
-              <w:bottom w:w="70" w:type="dxa"/>
-              <w:end w:w="95" w:type="dxa"/>
+              <w:top w:w="90" w:type="dxa"/>
+              <w:start w:w="110" w:type="dxa"/>
+              <w:bottom w:w="90" w:type="dxa"/>
+              <w:end w:w="110" w:type="dxa"/>
             </w:tcMar>
           </w:tcPr>
           <w:p>
             <w:pPr>
+              <w:spacing w:line="360" w:lineRule="auto" w:before="0" w:after="0"/>
               <w:jc w:val="center"/>
             </w:pPr>
             <w:r>
               <w:rPr>
-                <w:rFonts w:ascii="Arial" w:hAnsi="Arial" w:cs="Arial"/>
+                <w:rFonts w:ascii="Times New Roman" w:hAnsi="Times New Roman" w:cs="Times New Roman" w:eastAsia="Times New Roman"/>
                 <w:b/>
                 <w:color w:val="000000"/>
-                <w:sz w:val="19"/>
+                <w:sz w:val="24"/>
               </w:rPr>
               <w:t>Параметр</w:t>
             </w:r>
@@ -126,8 +132,9 @@
         </w:tc>
         <w:tc>
           <w:tcPr>
-            <w:tcW w:type="dxa" w:w="5328"/>
+            <w:tcW w:type="dxa" w:w="5040"/>
             <w:vAlign w:val="center"/>
+            <w:shd w:val="clear" w:color="auto" w:fill="FFFFFF"/>
             <w:tcBorders>
               <w:top w:val="single" w:sz="8" w:space="0" w:color="000000"/>
               <w:left w:val="single" w:sz="8" w:space="0" w:color="000000"/>
@@ -137,22 +144,23 @@
               <w:insideV w:val="single" w:sz="8" w:space="0" w:color="000000"/>
             </w:tcBorders>
             <w:tcMar>
-              <w:top w:w="70" w:type="dxa"/>
-              <w:start w:w="95" w:type="dxa"/>
-              <w:bottom w:w="70" w:type="dxa"/>
-              <w:end w:w="95" w:type="dxa"/>
+              <w:top w:w="90" w:type="dxa"/>
+              <w:start w:w="110" w:type="dxa"/>
+              <w:bottom w:w="90" w:type="dxa"/>
+              <w:end w:w="110" w:type="dxa"/>
             </w:tcMar>
           </w:tcPr>
           <w:p>
             <w:pPr>
+              <w:spacing w:line="360" w:lineRule="auto" w:before="0" w:after="0"/>
               <w:jc w:val="center"/>
             </w:pPr>
             <w:r>
               <w:rPr>
-                <w:rFonts w:ascii="Arial" w:hAnsi="Arial" w:cs="Arial"/>
+                <w:rFonts w:ascii="Times New Roman" w:hAnsi="Times New Roman" w:cs="Times New Roman" w:eastAsia="Times New Roman"/>
                 <w:b/>
                 <w:color w:val="000000"/>
-                <w:sz w:val="19"/>
+                <w:sz w:val="24"/>
               </w:rPr>
               <w:t>Результат</w:t>
             </w:r>
@@ -162,8 +170,9 @@
       <w:tr>
         <w:tc>
           <w:tcPr>
-            <w:tcW w:type="dxa" w:w="3600"/>
+            <w:tcW w:type="dxa" w:w="3744"/>
             <w:vAlign w:val="center"/>
+            <w:shd w:val="clear" w:color="auto" w:fill="FFFFFF"/>
             <w:tcBorders>
               <w:top w:val="single" w:sz="8" w:space="0" w:color="000000"/>
               <w:left w:val="single" w:sz="8" w:space="0" w:color="000000"/>
@@ -173,22 +182,23 @@
               <w:insideV w:val="single" w:sz="8" w:space="0" w:color="000000"/>
             </w:tcBorders>
             <w:tcMar>
-              <w:top w:w="70" w:type="dxa"/>
-              <w:start w:w="95" w:type="dxa"/>
-              <w:bottom w:w="70" w:type="dxa"/>
-              <w:end w:w="95" w:type="dxa"/>
+              <w:top w:w="90" w:type="dxa"/>
+              <w:start w:w="110" w:type="dxa"/>
+              <w:bottom w:w="90" w:type="dxa"/>
+              <w:end w:w="110" w:type="dxa"/>
             </w:tcMar>
           </w:tcPr>
           <w:p>
             <w:pPr>
+              <w:spacing w:line="360" w:lineRule="auto" w:before="0" w:after="0"/>
               <w:jc w:val="left"/>
             </w:pPr>
             <w:r>
               <w:rPr>
-                <w:rFonts w:ascii="Arial" w:hAnsi="Arial" w:cs="Arial"/>
+                <w:rFonts w:ascii="Times New Roman" w:hAnsi="Times New Roman" w:cs="Times New Roman" w:eastAsia="Times New Roman"/>
                 <w:b w:val="0"/>
                 <w:color w:val="000000"/>
-                <w:sz w:val="19"/>
+                <w:sz w:val="24"/>
               </w:rPr>
               <w:t>Лучшие параметры</w:t>
             </w:r>
@@ -196,8 +206,9 @@
         </w:tc>
         <w:tc>
           <w:tcPr>
-            <w:tcW w:type="dxa" w:w="5328"/>
+            <w:tcW w:type="dxa" w:w="5040"/>
             <w:vAlign w:val="center"/>
+            <w:shd w:val="clear" w:color="auto" w:fill="FFFFFF"/>
             <w:tcBorders>
               <w:top w:val="single" w:sz="8" w:space="0" w:color="000000"/>
               <w:left w:val="single" w:sz="8" w:space="0" w:color="000000"/>
@@ -207,22 +218,23 @@
               <w:insideV w:val="single" w:sz="8" w:space="0" w:color="000000"/>
             </w:tcBorders>
             <w:tcMar>
-              <w:top w:w="70" w:type="dxa"/>
-              <w:start w:w="95" w:type="dxa"/>
-              <w:bottom w:w="70" w:type="dxa"/>
-              <w:end w:w="95" w:type="dxa"/>
+              <w:top w:w="90" w:type="dxa"/>
+              <w:start w:w="110" w:type="dxa"/>
+              <w:bottom w:w="90" w:type="dxa"/>
+              <w:end w:w="110" w:type="dxa"/>
             </w:tcMar>
           </w:tcPr>
           <w:p>
             <w:pPr>
+              <w:spacing w:line="360" w:lineRule="auto" w:before="0" w:after="0"/>
               <w:jc w:val="center"/>
             </w:pPr>
             <w:r>
               <w:rPr>
-                <w:rFonts w:ascii="Arial" w:hAnsi="Arial" w:cs="Arial"/>
+                <w:rFonts w:ascii="Times New Roman" w:hAnsi="Times New Roman" w:cs="Times New Roman" w:eastAsia="Times New Roman"/>
                 <w:b w:val="0"/>
                 <w:color w:val="000000"/>
-                <w:sz w:val="19"/>
+                <w:sz w:val="24"/>
               </w:rPr>
               <w:t>depth = 4, learning_rate = 0.05</w:t>
             </w:r>
@@ -232,8 +244,9 @@
       <w:tr>
         <w:tc>
           <w:tcPr>
-            <w:tcW w:type="dxa" w:w="3600"/>
+            <w:tcW w:type="dxa" w:w="3744"/>
             <w:vAlign w:val="center"/>
+            <w:shd w:val="clear" w:color="auto" w:fill="FFFFFF"/>
             <w:tcBorders>
               <w:top w:val="single" w:sz="8" w:space="0" w:color="000000"/>
               <w:left w:val="single" w:sz="8" w:space="0" w:color="000000"/>
@@ -243,22 +256,23 @@
               <w:insideV w:val="single" w:sz="8" w:space="0" w:color="000000"/>
             </w:tcBorders>
             <w:tcMar>
-              <w:top w:w="70" w:type="dxa"/>
-              <w:start w:w="95" w:type="dxa"/>
-              <w:bottom w:w="70" w:type="dxa"/>
-              <w:end w:w="95" w:type="dxa"/>
+              <w:top w:w="90" w:type="dxa"/>
+              <w:start w:w="110" w:type="dxa"/>
+              <w:bottom w:w="90" w:type="dxa"/>
+              <w:end w:w="110" w:type="dxa"/>
             </w:tcMar>
           </w:tcPr>
           <w:p>
             <w:pPr>
+              <w:spacing w:line="360" w:lineRule="auto" w:before="0" w:after="0"/>
               <w:jc w:val="left"/>
             </w:pPr>
             <w:r>
               <w:rPr>
-                <w:rFonts w:ascii="Arial" w:hAnsi="Arial" w:cs="Arial"/>
+                <w:rFonts w:ascii="Times New Roman" w:hAnsi="Times New Roman" w:cs="Times New Roman" w:eastAsia="Times New Roman"/>
                 <w:b w:val="0"/>
                 <w:color w:val="000000"/>
-                <w:sz w:val="19"/>
+                <w:sz w:val="24"/>
               </w:rPr>
               <w:t>ROC-AUC по 3-fold CV</w:t>
             </w:r>
@@ -266,8 +280,9 @@
         </w:tc>
         <w:tc>
           <w:tcPr>
-            <w:tcW w:type="dxa" w:w="5328"/>
+            <w:tcW w:type="dxa" w:w="5040"/>
             <w:vAlign w:val="center"/>
+            <w:shd w:val="clear" w:color="auto" w:fill="FFFFFF"/>
             <w:tcBorders>
               <w:top w:val="single" w:sz="8" w:space="0" w:color="000000"/>
               <w:left w:val="single" w:sz="8" w:space="0" w:color="000000"/>
@@ -277,22 +292,23 @@
               <w:insideV w:val="single" w:sz="8" w:space="0" w:color="000000"/>
             </w:tcBorders>
             <w:tcMar>
-              <w:top w:w="70" w:type="dxa"/>
-              <w:start w:w="95" w:type="dxa"/>
-              <w:bottom w:w="70" w:type="dxa"/>
-              <w:end w:w="95" w:type="dxa"/>
+              <w:top w:w="90" w:type="dxa"/>
+              <w:start w:w="110" w:type="dxa"/>
+              <w:bottom w:w="90" w:type="dxa"/>
+              <w:end w:w="110" w:type="dxa"/>
             </w:tcMar>
           </w:tcPr>
           <w:p>
             <w:pPr>
+              <w:spacing w:line="360" w:lineRule="auto" w:before="0" w:after="0"/>
               <w:jc w:val="center"/>
             </w:pPr>
             <w:r>
               <w:rPr>
-                <w:rFonts w:ascii="Arial" w:hAnsi="Arial" w:cs="Arial"/>
+                <w:rFonts w:ascii="Times New Roman" w:hAnsi="Times New Roman" w:cs="Times New Roman" w:eastAsia="Times New Roman"/>
                 <w:b w:val="0"/>
                 <w:color w:val="000000"/>
-                <w:sz w:val="19"/>
+                <w:sz w:val="24"/>
               </w:rPr>
               <w:t>0.8496</w:t>
             </w:r>
@@ -302,22 +318,24 @@
     </w:tbl>
     <w:p>
       <w:pPr>
-        <w:spacing w:after="20"/>
+        <w:spacing w:line="360" w:lineRule="auto" w:before="0" w:after="0"/>
+        <w:jc w:val="left"/>
       </w:pPr>
     </w:p>
     <w:p>
       <w:pPr>
         <w:keepNext/>
-        <w:spacing w:before="200" w:after="80"/>
+        <w:spacing w:line="360" w:lineRule="auto" w:before="200" w:after="60"/>
+        <w:jc w:val="left"/>
       </w:pPr>
       <w:r>
         <w:rPr>
-          <w:rFonts w:ascii="Arial" w:hAnsi="Arial" w:cs="Arial"/>
+          <w:rFonts w:ascii="Times New Roman" w:hAnsi="Times New Roman" w:cs="Times New Roman" w:eastAsia="Times New Roman"/>
           <w:b/>
           <w:color w:val="000000"/>
-          <w:sz w:val="26"/>
+          <w:sz w:val="24"/>
         </w:rPr>
-        <w:t>Качество CatBoost на тесте</w:t>
+        <w:t>Качество CatBoost на тестовой выборке</w:t>
       </w:r>
     </w:p>
     <w:tbl>
@@ -339,6 +357,7 @@
           <w:tcPr>
             <w:tcW w:type="dxa" w:w="5472"/>
             <w:vAlign w:val="center"/>
+            <w:shd w:val="clear" w:color="auto" w:fill="FFFFFF"/>
             <w:tcBorders>
               <w:top w:val="single" w:sz="8" w:space="0" w:color="000000"/>
               <w:left w:val="single" w:sz="8" w:space="0" w:color="000000"/>
@@ -348,22 +367,23 @@
               <w:insideV w:val="single" w:sz="8" w:space="0" w:color="000000"/>
             </w:tcBorders>
             <w:tcMar>
-              <w:top w:w="70" w:type="dxa"/>
-              <w:start w:w="95" w:type="dxa"/>
-              <w:bottom w:w="70" w:type="dxa"/>
-              <w:end w:w="95" w:type="dxa"/>
+              <w:top w:w="90" w:type="dxa"/>
+              <w:start w:w="110" w:type="dxa"/>
+              <w:bottom w:w="90" w:type="dxa"/>
+              <w:end w:w="110" w:type="dxa"/>
             </w:tcMar>
           </w:tcPr>
           <w:p>
             <w:pPr>
+              <w:spacing w:line="360" w:lineRule="auto" w:before="0" w:after="0"/>
               <w:jc w:val="center"/>
             </w:pPr>
             <w:r>
               <w:rPr>
-                <w:rFonts w:ascii="Arial" w:hAnsi="Arial" w:cs="Arial"/>
+                <w:rFonts w:ascii="Times New Roman" w:hAnsi="Times New Roman" w:cs="Times New Roman" w:eastAsia="Times New Roman"/>
                 <w:b/>
                 <w:color w:val="000000"/>
-                <w:sz w:val="19"/>
+                <w:sz w:val="24"/>
               </w:rPr>
               <w:t>Метрика</w:t>
             </w:r>
@@ -371,8 +391,9 @@
         </w:tc>
         <w:tc>
           <w:tcPr>
-            <w:tcW w:type="dxa" w:w="3456"/>
+            <w:tcW w:type="dxa" w:w="3312"/>
             <w:vAlign w:val="center"/>
+            <w:shd w:val="clear" w:color="auto" w:fill="FFFFFF"/>
             <w:tcBorders>
               <w:top w:val="single" w:sz="8" w:space="0" w:color="000000"/>
               <w:left w:val="single" w:sz="8" w:space="0" w:color="000000"/>
@@ -382,22 +403,23 @@
               <w:insideV w:val="single" w:sz="8" w:space="0" w:color="000000"/>
             </w:tcBorders>
             <w:tcMar>
-              <w:top w:w="70" w:type="dxa"/>
-              <w:start w:w="95" w:type="dxa"/>
-              <w:bottom w:w="70" w:type="dxa"/>
-              <w:end w:w="95" w:type="dxa"/>
+              <w:top w:w="90" w:type="dxa"/>
+              <w:start w:w="110" w:type="dxa"/>
+              <w:bottom w:w="90" w:type="dxa"/>
+              <w:end w:w="110" w:type="dxa"/>
             </w:tcMar>
           </w:tcPr>
           <w:p>
             <w:pPr>
+              <w:spacing w:line="360" w:lineRule="auto" w:before="0" w:after="0"/>
               <w:jc w:val="center"/>
             </w:pPr>
             <w:r>
               <w:rPr>
-                <w:rFonts w:ascii="Arial" w:hAnsi="Arial" w:cs="Arial"/>
+                <w:rFonts w:ascii="Times New Roman" w:hAnsi="Times New Roman" w:cs="Times New Roman" w:eastAsia="Times New Roman"/>
                 <w:b/>
                 <w:color w:val="000000"/>
-                <w:sz w:val="19"/>
+                <w:sz w:val="24"/>
               </w:rPr>
               <w:t>Значение</w:t>
             </w:r>
@@ -409,6 +431,7 @@
           <w:tcPr>
             <w:tcW w:type="dxa" w:w="5472"/>
             <w:vAlign w:val="center"/>
+            <w:shd w:val="clear" w:color="auto" w:fill="FFFFFF"/>
             <w:tcBorders>
               <w:top w:val="single" w:sz="8" w:space="0" w:color="000000"/>
               <w:left w:val="single" w:sz="8" w:space="0" w:color="000000"/>
@@ -418,22 +441,23 @@
               <w:insideV w:val="single" w:sz="8" w:space="0" w:color="000000"/>
             </w:tcBorders>
             <w:tcMar>
-              <w:top w:w="70" w:type="dxa"/>
-              <w:start w:w="95" w:type="dxa"/>
-              <w:bottom w:w="70" w:type="dxa"/>
-              <w:end w:w="95" w:type="dxa"/>
+              <w:top w:w="90" w:type="dxa"/>
+              <w:start w:w="110" w:type="dxa"/>
+              <w:bottom w:w="90" w:type="dxa"/>
+              <w:end w:w="110" w:type="dxa"/>
             </w:tcMar>
           </w:tcPr>
           <w:p>
             <w:pPr>
+              <w:spacing w:line="360" w:lineRule="auto" w:before="0" w:after="0"/>
               <w:jc w:val="left"/>
             </w:pPr>
             <w:r>
               <w:rPr>
-                <w:rFonts w:ascii="Arial" w:hAnsi="Arial" w:cs="Arial"/>
+                <w:rFonts w:ascii="Times New Roman" w:hAnsi="Times New Roman" w:cs="Times New Roman" w:eastAsia="Times New Roman"/>
                 <w:b w:val="0"/>
                 <w:color w:val="000000"/>
-                <w:sz w:val="19"/>
+                <w:sz w:val="24"/>
               </w:rPr>
               <w:t>ROC-AUC</w:t>
             </w:r>
@@ -441,8 +465,9 @@
         </w:tc>
         <w:tc>
           <w:tcPr>
-            <w:tcW w:type="dxa" w:w="3456"/>
+            <w:tcW w:type="dxa" w:w="3312"/>
             <w:vAlign w:val="center"/>
+            <w:shd w:val="clear" w:color="auto" w:fill="FFFFFF"/>
             <w:tcBorders>
               <w:top w:val="single" w:sz="8" w:space="0" w:color="000000"/>
               <w:left w:val="single" w:sz="8" w:space="0" w:color="000000"/>
@@ -452,22 +477,23 @@
               <w:insideV w:val="single" w:sz="8" w:space="0" w:color="000000"/>
             </w:tcBorders>
             <w:tcMar>
-              <w:top w:w="70" w:type="dxa"/>
-              <w:start w:w="95" w:type="dxa"/>
-              <w:bottom w:w="70" w:type="dxa"/>
-              <w:end w:w="95" w:type="dxa"/>
+              <w:top w:w="90" w:type="dxa"/>
+              <w:start w:w="110" w:type="dxa"/>
+              <w:bottom w:w="90" w:type="dxa"/>
+              <w:end w:w="110" w:type="dxa"/>
             </w:tcMar>
           </w:tcPr>
           <w:p>
             <w:pPr>
+              <w:spacing w:line="360" w:lineRule="auto" w:before="0" w:after="0"/>
               <w:jc w:val="center"/>
             </w:pPr>
             <w:r>
               <w:rPr>
-                <w:rFonts w:ascii="Arial" w:hAnsi="Arial" w:cs="Arial"/>
+                <w:rFonts w:ascii="Times New Roman" w:hAnsi="Times New Roman" w:cs="Times New Roman" w:eastAsia="Times New Roman"/>
                 <w:b w:val="0"/>
                 <w:color w:val="000000"/>
-                <w:sz w:val="19"/>
+                <w:sz w:val="24"/>
               </w:rPr>
               <w:t>0.8466</w:t>
             </w:r>
@@ -479,6 +505,7 @@
           <w:tcPr>
             <w:tcW w:type="dxa" w:w="5472"/>
             <w:vAlign w:val="center"/>
+            <w:shd w:val="clear" w:color="auto" w:fill="FFFFFF"/>
             <w:tcBorders>
               <w:top w:val="single" w:sz="8" w:space="0" w:color="000000"/>
               <w:left w:val="single" w:sz="8" w:space="0" w:color="000000"/>
@@ -488,22 +515,23 @@
               <w:insideV w:val="single" w:sz="8" w:space="0" w:color="000000"/>
             </w:tcBorders>
             <w:tcMar>
-              <w:top w:w="70" w:type="dxa"/>
-              <w:start w:w="95" w:type="dxa"/>
-              <w:bottom w:w="70" w:type="dxa"/>
-              <w:end w:w="95" w:type="dxa"/>
+              <w:top w:w="90" w:type="dxa"/>
+              <w:start w:w="110" w:type="dxa"/>
+              <w:bottom w:w="90" w:type="dxa"/>
+              <w:end w:w="110" w:type="dxa"/>
             </w:tcMar>
           </w:tcPr>
           <w:p>
             <w:pPr>
+              <w:spacing w:line="360" w:lineRule="auto" w:before="0" w:after="0"/>
               <w:jc w:val="left"/>
             </w:pPr>
             <w:r>
               <w:rPr>
-                <w:rFonts w:ascii="Arial" w:hAnsi="Arial" w:cs="Arial"/>
+                <w:rFonts w:ascii="Times New Roman" w:hAnsi="Times New Roman" w:cs="Times New Roman" w:eastAsia="Times New Roman"/>
                 <w:b w:val="0"/>
                 <w:color w:val="000000"/>
-                <w:sz w:val="19"/>
+                <w:sz w:val="24"/>
               </w:rPr>
               <w:t>F1 для класса Ушёл</w:t>
             </w:r>
@@ -511,8 +539,9 @@
         </w:tc>
         <w:tc>
           <w:tcPr>
-            <w:tcW w:type="dxa" w:w="3456"/>
+            <w:tcW w:type="dxa" w:w="3312"/>
             <w:vAlign w:val="center"/>
+            <w:shd w:val="clear" w:color="auto" w:fill="FFFFFF"/>
             <w:tcBorders>
               <w:top w:val="single" w:sz="8" w:space="0" w:color="000000"/>
               <w:left w:val="single" w:sz="8" w:space="0" w:color="000000"/>
@@ -522,22 +551,23 @@
               <w:insideV w:val="single" w:sz="8" w:space="0" w:color="000000"/>
             </w:tcBorders>
             <w:tcMar>
-              <w:top w:w="70" w:type="dxa"/>
-              <w:start w:w="95" w:type="dxa"/>
-              <w:bottom w:w="70" w:type="dxa"/>
-              <w:end w:w="95" w:type="dxa"/>
+              <w:top w:w="90" w:type="dxa"/>
+              <w:start w:w="110" w:type="dxa"/>
+              <w:bottom w:w="90" w:type="dxa"/>
+              <w:end w:w="110" w:type="dxa"/>
             </w:tcMar>
           </w:tcPr>
           <w:p>
             <w:pPr>
+              <w:spacing w:line="360" w:lineRule="auto" w:before="0" w:after="0"/>
               <w:jc w:val="center"/>
             </w:pPr>
             <w:r>
               <w:rPr>
-                <w:rFonts w:ascii="Arial" w:hAnsi="Arial" w:cs="Arial"/>
+                <w:rFonts w:ascii="Times New Roman" w:hAnsi="Times New Roman" w:cs="Times New Roman" w:eastAsia="Times New Roman"/>
                 <w:b w:val="0"/>
                 <w:color w:val="000000"/>
-                <w:sz w:val="19"/>
+                <w:sz w:val="24"/>
               </w:rPr>
               <w:t>0.5857</w:t>
             </w:r>
@@ -549,6 +579,7 @@
           <w:tcPr>
             <w:tcW w:type="dxa" w:w="5472"/>
             <w:vAlign w:val="center"/>
+            <w:shd w:val="clear" w:color="auto" w:fill="FFFFFF"/>
             <w:tcBorders>
               <w:top w:val="single" w:sz="8" w:space="0" w:color="000000"/>
               <w:left w:val="single" w:sz="8" w:space="0" w:color="000000"/>
@@ -558,22 +589,23 @@
               <w:insideV w:val="single" w:sz="8" w:space="0" w:color="000000"/>
             </w:tcBorders>
             <w:tcMar>
-              <w:top w:w="70" w:type="dxa"/>
-              <w:start w:w="95" w:type="dxa"/>
-              <w:bottom w:w="70" w:type="dxa"/>
-              <w:end w:w="95" w:type="dxa"/>
+              <w:top w:w="90" w:type="dxa"/>
+              <w:start w:w="110" w:type="dxa"/>
+              <w:bottom w:w="90" w:type="dxa"/>
+              <w:end w:w="110" w:type="dxa"/>
             </w:tcMar>
           </w:tcPr>
           <w:p>
             <w:pPr>
+              <w:spacing w:line="360" w:lineRule="auto" w:before="0" w:after="0"/>
               <w:jc w:val="left"/>
             </w:pPr>
             <w:r>
               <w:rPr>
-                <w:rFonts w:ascii="Arial" w:hAnsi="Arial" w:cs="Arial"/>
+                <w:rFonts w:ascii="Times New Roman" w:hAnsi="Times New Roman" w:cs="Times New Roman" w:eastAsia="Times New Roman"/>
                 <w:b w:val="0"/>
                 <w:color w:val="000000"/>
-                <w:sz w:val="19"/>
+                <w:sz w:val="24"/>
               </w:rPr>
               <w:t>Recall для класса Ушёл</w:t>
             </w:r>
@@ -581,8 +613,9 @@
         </w:tc>
         <w:tc>
           <w:tcPr>
-            <w:tcW w:type="dxa" w:w="3456"/>
+            <w:tcW w:type="dxa" w:w="3312"/>
             <w:vAlign w:val="center"/>
+            <w:shd w:val="clear" w:color="auto" w:fill="FFFFFF"/>
             <w:tcBorders>
               <w:top w:val="single" w:sz="8" w:space="0" w:color="000000"/>
               <w:left w:val="single" w:sz="8" w:space="0" w:color="000000"/>
@@ -592,22 +625,23 @@
               <w:insideV w:val="single" w:sz="8" w:space="0" w:color="000000"/>
             </w:tcBorders>
             <w:tcMar>
-              <w:top w:w="70" w:type="dxa"/>
-              <w:start w:w="95" w:type="dxa"/>
-              <w:bottom w:w="70" w:type="dxa"/>
-              <w:end w:w="95" w:type="dxa"/>
+              <w:top w:w="90" w:type="dxa"/>
+              <w:start w:w="110" w:type="dxa"/>
+              <w:bottom w:w="90" w:type="dxa"/>
+              <w:end w:w="110" w:type="dxa"/>
             </w:tcMar>
           </w:tcPr>
           <w:p>
             <w:pPr>
+              <w:spacing w:line="360" w:lineRule="auto" w:before="0" w:after="0"/>
               <w:jc w:val="center"/>
             </w:pPr>
             <w:r>
               <w:rPr>
-                <w:rFonts w:ascii="Arial" w:hAnsi="Arial" w:cs="Arial"/>
+                <w:rFonts w:ascii="Times New Roman" w:hAnsi="Times New Roman" w:cs="Times New Roman" w:eastAsia="Times New Roman"/>
                 <w:b w:val="0"/>
                 <w:color w:val="000000"/>
-                <w:sz w:val="19"/>
+                <w:sz w:val="24"/>
               </w:rPr>
               <w:t>0.5160</w:t>
             </w:r>
@@ -617,20 +651,22 @@
     </w:tbl>
     <w:p>
       <w:pPr>
-        <w:spacing w:after="20"/>
+        <w:spacing w:line="360" w:lineRule="auto" w:before="0" w:after="0"/>
+        <w:jc w:val="left"/>
       </w:pPr>
     </w:p>
     <w:p>
       <w:pPr>
         <w:keepNext/>
-        <w:spacing w:before="200" w:after="80"/>
+        <w:spacing w:line="360" w:lineRule="auto" w:before="200" w:after="60"/>
+        <w:jc w:val="left"/>
       </w:pPr>
       <w:r>
         <w:rPr>
-          <w:rFonts w:ascii="Arial" w:hAnsi="Arial" w:cs="Arial"/>
+          <w:rFonts w:ascii="Times New Roman" w:hAnsi="Times New Roman" w:cs="Times New Roman" w:eastAsia="Times New Roman"/>
           <w:b/>
           <w:color w:val="000000"/>
-          <w:sz w:val="26"/>
+          <w:sz w:val="24"/>
         </w:rPr>
         <w:t>Сравнение моделей</w:t>
       </w:r>
@@ -656,6 +692,7 @@
           <w:tcPr>
             <w:tcW w:type="dxa" w:w="3888"/>
             <w:vAlign w:val="center"/>
+            <w:shd w:val="clear" w:color="auto" w:fill="FFFFFF"/>
             <w:tcBorders>
               <w:top w:val="single" w:sz="8" w:space="0" w:color="000000"/>
               <w:left w:val="single" w:sz="8" w:space="0" w:color="000000"/>
@@ -665,22 +702,23 @@
               <w:insideV w:val="single" w:sz="8" w:space="0" w:color="000000"/>
             </w:tcBorders>
             <w:tcMar>
-              <w:top w:w="70" w:type="dxa"/>
-              <w:start w:w="95" w:type="dxa"/>
-              <w:bottom w:w="70" w:type="dxa"/>
-              <w:end w:w="95" w:type="dxa"/>
+              <w:top w:w="90" w:type="dxa"/>
+              <w:start w:w="110" w:type="dxa"/>
+              <w:bottom w:w="90" w:type="dxa"/>
+              <w:end w:w="110" w:type="dxa"/>
             </w:tcMar>
           </w:tcPr>
           <w:p>
             <w:pPr>
+              <w:spacing w:line="360" w:lineRule="auto" w:before="0" w:after="0"/>
               <w:jc w:val="center"/>
             </w:pPr>
             <w:r>
               <w:rPr>
-                <w:rFonts w:ascii="Arial" w:hAnsi="Arial" w:cs="Arial"/>
+                <w:rFonts w:ascii="Times New Roman" w:hAnsi="Times New Roman" w:cs="Times New Roman" w:eastAsia="Times New Roman"/>
                 <w:b/>
                 <w:color w:val="000000"/>
-                <w:sz w:val="19"/>
+                <w:sz w:val="24"/>
               </w:rPr>
               <w:t>Модель</w:t>
             </w:r>
@@ -690,6 +728,7 @@
           <w:tcPr>
             <w:tcW w:type="dxa" w:w="1584"/>
             <w:vAlign w:val="center"/>
+            <w:shd w:val="clear" w:color="auto" w:fill="FFFFFF"/>
             <w:tcBorders>
               <w:top w:val="single" w:sz="8" w:space="0" w:color="000000"/>
               <w:left w:val="single" w:sz="8" w:space="0" w:color="000000"/>
@@ -699,22 +738,23 @@
               <w:insideV w:val="single" w:sz="8" w:space="0" w:color="000000"/>
             </w:tcBorders>
             <w:tcMar>
-              <w:top w:w="70" w:type="dxa"/>
-              <w:start w:w="95" w:type="dxa"/>
-              <w:bottom w:w="70" w:type="dxa"/>
-              <w:end w:w="95" w:type="dxa"/>
+              <w:top w:w="90" w:type="dxa"/>
+              <w:start w:w="110" w:type="dxa"/>
+              <w:bottom w:w="90" w:type="dxa"/>
+              <w:end w:w="110" w:type="dxa"/>
             </w:tcMar>
           </w:tcPr>
           <w:p>
             <w:pPr>
+              <w:spacing w:line="360" w:lineRule="auto" w:before="0" w:after="0"/>
               <w:jc w:val="center"/>
             </w:pPr>
             <w:r>
               <w:rPr>
-                <w:rFonts w:ascii="Arial" w:hAnsi="Arial" w:cs="Arial"/>
+                <w:rFonts w:ascii="Times New Roman" w:hAnsi="Times New Roman" w:cs="Times New Roman" w:eastAsia="Times New Roman"/>
                 <w:b/>
                 <w:color w:val="000000"/>
-                <w:sz w:val="19"/>
+                <w:sz w:val="24"/>
               </w:rPr>
               <w:t>ROC-AUC</w:t>
             </w:r>
@@ -724,6 +764,7 @@
           <w:tcPr>
             <w:tcW w:type="dxa" w:w="1584"/>
             <w:vAlign w:val="center"/>
+            <w:shd w:val="clear" w:color="auto" w:fill="FFFFFF"/>
             <w:tcBorders>
               <w:top w:val="single" w:sz="8" w:space="0" w:color="000000"/>
               <w:left w:val="single" w:sz="8" w:space="0" w:color="000000"/>
@@ -733,22 +774,23 @@
               <w:insideV w:val="single" w:sz="8" w:space="0" w:color="000000"/>
             </w:tcBorders>
             <w:tcMar>
-              <w:top w:w="70" w:type="dxa"/>
-              <w:start w:w="95" w:type="dxa"/>
-              <w:bottom w:w="70" w:type="dxa"/>
-              <w:end w:w="95" w:type="dxa"/>
+              <w:top w:w="90" w:type="dxa"/>
+              <w:start w:w="110" w:type="dxa"/>
+              <w:bottom w:w="90" w:type="dxa"/>
+              <w:end w:w="110" w:type="dxa"/>
             </w:tcMar>
           </w:tcPr>
           <w:p>
             <w:pPr>
+              <w:spacing w:line="360" w:lineRule="auto" w:before="0" w:after="0"/>
               <w:jc w:val="center"/>
             </w:pPr>
             <w:r>
               <w:rPr>
-                <w:rFonts w:ascii="Arial" w:hAnsi="Arial" w:cs="Arial"/>
+                <w:rFonts w:ascii="Times New Roman" w:hAnsi="Times New Roman" w:cs="Times New Roman" w:eastAsia="Times New Roman"/>
                 <w:b/>
                 <w:color w:val="000000"/>
-                <w:sz w:val="19"/>
+                <w:sz w:val="24"/>
               </w:rPr>
               <w:t>F1</w:t>
             </w:r>
@@ -758,6 +800,7 @@
           <w:tcPr>
             <w:tcW w:type="dxa" w:w="1584"/>
             <w:vAlign w:val="center"/>
+            <w:shd w:val="clear" w:color="auto" w:fill="FFFFFF"/>
             <w:tcBorders>
               <w:top w:val="single" w:sz="8" w:space="0" w:color="000000"/>
               <w:left w:val="single" w:sz="8" w:space="0" w:color="000000"/>
@@ -767,22 +810,23 @@
               <w:insideV w:val="single" w:sz="8" w:space="0" w:color="000000"/>
             </w:tcBorders>
             <w:tcMar>
-              <w:top w:w="70" w:type="dxa"/>
-              <w:start w:w="95" w:type="dxa"/>
-              <w:bottom w:w="70" w:type="dxa"/>
-              <w:end w:w="95" w:type="dxa"/>
+              <w:top w:w="90" w:type="dxa"/>
+              <w:start w:w="110" w:type="dxa"/>
+              <w:bottom w:w="90" w:type="dxa"/>
+              <w:end w:w="110" w:type="dxa"/>
             </w:tcMar>
           </w:tcPr>
           <w:p>
             <w:pPr>
+              <w:spacing w:line="360" w:lineRule="auto" w:before="0" w:after="0"/>
               <w:jc w:val="center"/>
             </w:pPr>
             <w:r>
               <w:rPr>
-                <w:rFonts w:ascii="Arial" w:hAnsi="Arial" w:cs="Arial"/>
+                <w:rFonts w:ascii="Times New Roman" w:hAnsi="Times New Roman" w:cs="Times New Roman" w:eastAsia="Times New Roman"/>
                 <w:b/>
                 <w:color w:val="000000"/>
-                <w:sz w:val="19"/>
+                <w:sz w:val="24"/>
               </w:rPr>
               <w:t>Recall</w:t>
             </w:r>
@@ -794,6 +838,7 @@
           <w:tcPr>
             <w:tcW w:type="dxa" w:w="3888"/>
             <w:vAlign w:val="center"/>
+            <w:shd w:val="clear" w:color="auto" w:fill="FFFFFF"/>
             <w:tcBorders>
               <w:top w:val="single" w:sz="8" w:space="0" w:color="000000"/>
               <w:left w:val="single" w:sz="8" w:space="0" w:color="000000"/>
@@ -803,22 +848,23 @@
               <w:insideV w:val="single" w:sz="8" w:space="0" w:color="000000"/>
             </w:tcBorders>
             <w:tcMar>
-              <w:top w:w="70" w:type="dxa"/>
-              <w:start w:w="95" w:type="dxa"/>
-              <w:bottom w:w="70" w:type="dxa"/>
-              <w:end w:w="95" w:type="dxa"/>
+              <w:top w:w="90" w:type="dxa"/>
+              <w:start w:w="110" w:type="dxa"/>
+              <w:bottom w:w="90" w:type="dxa"/>
+              <w:end w:w="110" w:type="dxa"/>
             </w:tcMar>
           </w:tcPr>
           <w:p>
             <w:pPr>
+              <w:spacing w:line="360" w:lineRule="auto" w:before="0" w:after="0"/>
               <w:jc w:val="left"/>
             </w:pPr>
             <w:r>
               <w:rPr>
-                <w:rFonts w:ascii="Arial" w:hAnsi="Arial" w:cs="Arial"/>
+                <w:rFonts w:ascii="Times New Roman" w:hAnsi="Times New Roman" w:cs="Times New Roman" w:eastAsia="Times New Roman"/>
                 <w:b w:val="0"/>
                 <w:color w:val="000000"/>
-                <w:sz w:val="19"/>
+                <w:sz w:val="24"/>
               </w:rPr>
               <w:t>Logistic Regression</w:t>
             </w:r>
@@ -828,6 +874,7 @@
           <w:tcPr>
             <w:tcW w:type="dxa" w:w="1584"/>
             <w:vAlign w:val="center"/>
+            <w:shd w:val="clear" w:color="auto" w:fill="FFFFFF"/>
             <w:tcBorders>
               <w:top w:val="single" w:sz="8" w:space="0" w:color="000000"/>
               <w:left w:val="single" w:sz="8" w:space="0" w:color="000000"/>
@@ -837,22 +884,23 @@
               <w:insideV w:val="single" w:sz="8" w:space="0" w:color="000000"/>
             </w:tcBorders>
             <w:tcMar>
-              <w:top w:w="70" w:type="dxa"/>
-              <w:start w:w="95" w:type="dxa"/>
-              <w:bottom w:w="70" w:type="dxa"/>
-              <w:end w:w="95" w:type="dxa"/>
+              <w:top w:w="90" w:type="dxa"/>
+              <w:start w:w="110" w:type="dxa"/>
+              <w:bottom w:w="90" w:type="dxa"/>
+              <w:end w:w="110" w:type="dxa"/>
             </w:tcMar>
           </w:tcPr>
           <w:p>
             <w:pPr>
+              <w:spacing w:line="360" w:lineRule="auto" w:before="0" w:after="0"/>
               <w:jc w:val="center"/>
             </w:pPr>
             <w:r>
               <w:rPr>
-                <w:rFonts w:ascii="Arial" w:hAnsi="Arial" w:cs="Arial"/>
+                <w:rFonts w:ascii="Times New Roman" w:hAnsi="Times New Roman" w:cs="Times New Roman" w:eastAsia="Times New Roman"/>
                 <w:b w:val="0"/>
                 <w:color w:val="000000"/>
-                <w:sz w:val="19"/>
+                <w:sz w:val="24"/>
               </w:rPr>
               <w:t>0.8421</w:t>
             </w:r>
@@ -862,6 +910,7 @@
           <w:tcPr>
             <w:tcW w:type="dxa" w:w="1584"/>
             <w:vAlign w:val="center"/>
+            <w:shd w:val="clear" w:color="auto" w:fill="FFFFFF"/>
             <w:tcBorders>
               <w:top w:val="single" w:sz="8" w:space="0" w:color="000000"/>
               <w:left w:val="single" w:sz="8" w:space="0" w:color="000000"/>
@@ -871,22 +920,23 @@
               <w:insideV w:val="single" w:sz="8" w:space="0" w:color="000000"/>
             </w:tcBorders>
             <w:tcMar>
-              <w:top w:w="70" w:type="dxa"/>
-              <w:start w:w="95" w:type="dxa"/>
-              <w:bottom w:w="70" w:type="dxa"/>
-              <w:end w:w="95" w:type="dxa"/>
+              <w:top w:w="90" w:type="dxa"/>
+              <w:start w:w="110" w:type="dxa"/>
+              <w:bottom w:w="90" w:type="dxa"/>
+              <w:end w:w="110" w:type="dxa"/>
             </w:tcMar>
           </w:tcPr>
           <w:p>
             <w:pPr>
+              <w:spacing w:line="360" w:lineRule="auto" w:before="0" w:after="0"/>
               <w:jc w:val="center"/>
             </w:pPr>
             <w:r>
               <w:rPr>
-                <w:rFonts w:ascii="Arial" w:hAnsi="Arial" w:cs="Arial"/>
+                <w:rFonts w:ascii="Times New Roman" w:hAnsi="Times New Roman" w:cs="Times New Roman" w:eastAsia="Times New Roman"/>
                 <w:b w:val="0"/>
                 <w:color w:val="000000"/>
-                <w:sz w:val="19"/>
+                <w:sz w:val="24"/>
               </w:rPr>
               <w:t>0.6040</w:t>
             </w:r>
@@ -896,6 +946,7 @@
           <w:tcPr>
             <w:tcW w:type="dxa" w:w="1584"/>
             <w:vAlign w:val="center"/>
+            <w:shd w:val="clear" w:color="auto" w:fill="FFFFFF"/>
             <w:tcBorders>
               <w:top w:val="single" w:sz="8" w:space="0" w:color="000000"/>
               <w:left w:val="single" w:sz="8" w:space="0" w:color="000000"/>
@@ -905,22 +956,23 @@
               <w:insideV w:val="single" w:sz="8" w:space="0" w:color="000000"/>
             </w:tcBorders>
             <w:tcMar>
-              <w:top w:w="70" w:type="dxa"/>
-              <w:start w:w="95" w:type="dxa"/>
-              <w:bottom w:w="70" w:type="dxa"/>
-              <w:end w:w="95" w:type="dxa"/>
+              <w:top w:w="90" w:type="dxa"/>
+              <w:start w:w="110" w:type="dxa"/>
+              <w:bottom w:w="90" w:type="dxa"/>
+              <w:end w:w="110" w:type="dxa"/>
             </w:tcMar>
           </w:tcPr>
           <w:p>
             <w:pPr>
+              <w:spacing w:line="360" w:lineRule="auto" w:before="0" w:after="0"/>
               <w:jc w:val="center"/>
             </w:pPr>
             <w:r>
               <w:rPr>
-                <w:rFonts w:ascii="Arial" w:hAnsi="Arial" w:cs="Arial"/>
+                <w:rFonts w:ascii="Times New Roman" w:hAnsi="Times New Roman" w:cs="Times New Roman" w:eastAsia="Times New Roman"/>
                 <w:b w:val="0"/>
                 <w:color w:val="000000"/>
-                <w:sz w:val="19"/>
+                <w:sz w:val="24"/>
               </w:rPr>
               <w:t>0.5588</w:t>
             </w:r>
@@ -932,6 +984,7 @@
           <w:tcPr>
             <w:tcW w:type="dxa" w:w="3888"/>
             <w:vAlign w:val="center"/>
+            <w:shd w:val="clear" w:color="auto" w:fill="FFFFFF"/>
             <w:tcBorders>
               <w:top w:val="single" w:sz="8" w:space="0" w:color="000000"/>
               <w:left w:val="single" w:sz="8" w:space="0" w:color="000000"/>
@@ -941,22 +994,23 @@
               <w:insideV w:val="single" w:sz="8" w:space="0" w:color="000000"/>
             </w:tcBorders>
             <w:tcMar>
-              <w:top w:w="70" w:type="dxa"/>
-              <w:start w:w="95" w:type="dxa"/>
-              <w:bottom w:w="70" w:type="dxa"/>
-              <w:end w:w="95" w:type="dxa"/>
+              <w:top w:w="90" w:type="dxa"/>
+              <w:start w:w="110" w:type="dxa"/>
+              <w:bottom w:w="90" w:type="dxa"/>
+              <w:end w:w="110" w:type="dxa"/>
             </w:tcMar>
           </w:tcPr>
           <w:p>
             <w:pPr>
+              <w:spacing w:line="360" w:lineRule="auto" w:before="0" w:after="0"/>
               <w:jc w:val="left"/>
             </w:pPr>
             <w:r>
               <w:rPr>
-                <w:rFonts w:ascii="Arial" w:hAnsi="Arial" w:cs="Arial"/>
+                <w:rFonts w:ascii="Times New Roman" w:hAnsi="Times New Roman" w:cs="Times New Roman" w:eastAsia="Times New Roman"/>
                 <w:b w:val="0"/>
                 <w:color w:val="000000"/>
-                <w:sz w:val="19"/>
+                <w:sz w:val="24"/>
               </w:rPr>
               <w:t>Random Forest</w:t>
             </w:r>
@@ -966,6 +1020,7 @@
           <w:tcPr>
             <w:tcW w:type="dxa" w:w="1584"/>
             <w:vAlign w:val="center"/>
+            <w:shd w:val="clear" w:color="auto" w:fill="FFFFFF"/>
             <w:tcBorders>
               <w:top w:val="single" w:sz="8" w:space="0" w:color="000000"/>
               <w:left w:val="single" w:sz="8" w:space="0" w:color="000000"/>
@@ -975,22 +1030,23 @@
               <w:insideV w:val="single" w:sz="8" w:space="0" w:color="000000"/>
             </w:tcBorders>
             <w:tcMar>
-              <w:top w:w="70" w:type="dxa"/>
-              <w:start w:w="95" w:type="dxa"/>
-              <w:bottom w:w="70" w:type="dxa"/>
-              <w:end w:w="95" w:type="dxa"/>
+              <w:top w:w="90" w:type="dxa"/>
+              <w:start w:w="110" w:type="dxa"/>
+              <w:bottom w:w="90" w:type="dxa"/>
+              <w:end w:w="110" w:type="dxa"/>
             </w:tcMar>
           </w:tcPr>
           <w:p>
             <w:pPr>
+              <w:spacing w:line="360" w:lineRule="auto" w:before="0" w:after="0"/>
               <w:jc w:val="center"/>
             </w:pPr>
             <w:r>
               <w:rPr>
-                <w:rFonts w:ascii="Arial" w:hAnsi="Arial" w:cs="Arial"/>
+                <w:rFonts w:ascii="Times New Roman" w:hAnsi="Times New Roman" w:cs="Times New Roman" w:eastAsia="Times New Roman"/>
                 <w:b w:val="0"/>
                 <w:color w:val="000000"/>
-                <w:sz w:val="19"/>
+                <w:sz w:val="24"/>
               </w:rPr>
               <w:t>0.8419</w:t>
             </w:r>
@@ -1000,6 +1056,7 @@
           <w:tcPr>
             <w:tcW w:type="dxa" w:w="1584"/>
             <w:vAlign w:val="center"/>
+            <w:shd w:val="clear" w:color="auto" w:fill="FFFFFF"/>
             <w:tcBorders>
               <w:top w:val="single" w:sz="8" w:space="0" w:color="000000"/>
               <w:left w:val="single" w:sz="8" w:space="0" w:color="000000"/>
@@ -1009,22 +1066,23 @@
               <w:insideV w:val="single" w:sz="8" w:space="0" w:color="000000"/>
             </w:tcBorders>
             <w:tcMar>
-              <w:top w:w="70" w:type="dxa"/>
-              <w:start w:w="95" w:type="dxa"/>
-              <w:bottom w:w="70" w:type="dxa"/>
-              <w:end w:w="95" w:type="dxa"/>
+              <w:top w:w="90" w:type="dxa"/>
+              <w:start w:w="110" w:type="dxa"/>
+              <w:bottom w:w="90" w:type="dxa"/>
+              <w:end w:w="110" w:type="dxa"/>
             </w:tcMar>
           </w:tcPr>
           <w:p>
             <w:pPr>
+              <w:spacing w:line="360" w:lineRule="auto" w:before="0" w:after="0"/>
               <w:jc w:val="center"/>
             </w:pPr>
             <w:r>
               <w:rPr>
-                <w:rFonts w:ascii="Arial" w:hAnsi="Arial" w:cs="Arial"/>
+                <w:rFonts w:ascii="Times New Roman" w:hAnsi="Times New Roman" w:cs="Times New Roman" w:eastAsia="Times New Roman"/>
                 <w:b w:val="0"/>
                 <w:color w:val="000000"/>
-                <w:sz w:val="19"/>
+                <w:sz w:val="24"/>
               </w:rPr>
               <w:t>0.5797</w:t>
             </w:r>
@@ -1034,6 +1092,7 @@
           <w:tcPr>
             <w:tcW w:type="dxa" w:w="1584"/>
             <w:vAlign w:val="center"/>
+            <w:shd w:val="clear" w:color="auto" w:fill="FFFFFF"/>
             <w:tcBorders>
               <w:top w:val="single" w:sz="8" w:space="0" w:color="000000"/>
               <w:left w:val="single" w:sz="8" w:space="0" w:color="000000"/>
@@ -1043,22 +1102,23 @@
               <w:insideV w:val="single" w:sz="8" w:space="0" w:color="000000"/>
             </w:tcBorders>
             <w:tcMar>
-              <w:top w:w="70" w:type="dxa"/>
-              <w:start w:w="95" w:type="dxa"/>
-              <w:bottom w:w="70" w:type="dxa"/>
-              <w:end w:w="95" w:type="dxa"/>
+              <w:top w:w="90" w:type="dxa"/>
+              <w:start w:w="110" w:type="dxa"/>
+              <w:bottom w:w="90" w:type="dxa"/>
+              <w:end w:w="110" w:type="dxa"/>
             </w:tcMar>
           </w:tcPr>
           <w:p>
             <w:pPr>
+              <w:spacing w:line="360" w:lineRule="auto" w:before="0" w:after="0"/>
               <w:jc w:val="center"/>
             </w:pPr>
             <w:r>
               <w:rPr>
-                <w:rFonts w:ascii="Arial" w:hAnsi="Arial" w:cs="Arial"/>
+                <w:rFonts w:ascii="Times New Roman" w:hAnsi="Times New Roman" w:cs="Times New Roman" w:eastAsia="Times New Roman"/>
                 <w:b w:val="0"/>
                 <w:color w:val="000000"/>
-                <w:sz w:val="19"/>
+                <w:sz w:val="24"/>
               </w:rPr>
               <w:t>0.5107</w:t>
             </w:r>
@@ -1070,6 +1130,7 @@
           <w:tcPr>
             <w:tcW w:type="dxa" w:w="3888"/>
             <w:vAlign w:val="center"/>
+            <w:shd w:val="clear" w:color="auto" w:fill="FFFFFF"/>
             <w:tcBorders>
               <w:top w:val="single" w:sz="8" w:space="0" w:color="000000"/>
               <w:left w:val="single" w:sz="8" w:space="0" w:color="000000"/>
@@ -1079,22 +1140,23 @@
               <w:insideV w:val="single" w:sz="8" w:space="0" w:color="000000"/>
             </w:tcBorders>
             <w:tcMar>
-              <w:top w:w="70" w:type="dxa"/>
-              <w:start w:w="95" w:type="dxa"/>
-              <w:bottom w:w="70" w:type="dxa"/>
-              <w:end w:w="95" w:type="dxa"/>
+              <w:top w:w="90" w:type="dxa"/>
+              <w:start w:w="110" w:type="dxa"/>
+              <w:bottom w:w="90" w:type="dxa"/>
+              <w:end w:w="110" w:type="dxa"/>
             </w:tcMar>
           </w:tcPr>
           <w:p>
             <w:pPr>
+              <w:spacing w:line="360" w:lineRule="auto" w:before="0" w:after="0"/>
               <w:jc w:val="left"/>
             </w:pPr>
             <w:r>
               <w:rPr>
-                <w:rFonts w:ascii="Arial" w:hAnsi="Arial" w:cs="Arial"/>
+                <w:rFonts w:ascii="Times New Roman" w:hAnsi="Times New Roman" w:cs="Times New Roman" w:eastAsia="Times New Roman"/>
                 <w:b w:val="0"/>
                 <w:color w:val="000000"/>
-                <w:sz w:val="19"/>
+                <w:sz w:val="24"/>
               </w:rPr>
               <w:t>CatBoost</w:t>
             </w:r>
@@ -1104,6 +1166,7 @@
           <w:tcPr>
             <w:tcW w:type="dxa" w:w="1584"/>
             <w:vAlign w:val="center"/>
+            <w:shd w:val="clear" w:color="auto" w:fill="FFFFFF"/>
             <w:tcBorders>
               <w:top w:val="single" w:sz="8" w:space="0" w:color="000000"/>
               <w:left w:val="single" w:sz="8" w:space="0" w:color="000000"/>
@@ -1113,22 +1176,23 @@
               <w:insideV w:val="single" w:sz="8" w:space="0" w:color="000000"/>
             </w:tcBorders>
             <w:tcMar>
-              <w:top w:w="70" w:type="dxa"/>
-              <w:start w:w="95" w:type="dxa"/>
-              <w:bottom w:w="70" w:type="dxa"/>
-              <w:end w:w="95" w:type="dxa"/>
+              <w:top w:w="90" w:type="dxa"/>
+              <w:start w:w="110" w:type="dxa"/>
+              <w:bottom w:w="90" w:type="dxa"/>
+              <w:end w:w="110" w:type="dxa"/>
             </w:tcMar>
           </w:tcPr>
           <w:p>
             <w:pPr>
+              <w:spacing w:line="360" w:lineRule="auto" w:before="0" w:after="0"/>
               <w:jc w:val="center"/>
             </w:pPr>
             <w:r>
               <w:rPr>
-                <w:rFonts w:ascii="Arial" w:hAnsi="Arial" w:cs="Arial"/>
+                <w:rFonts w:ascii="Times New Roman" w:hAnsi="Times New Roman" w:cs="Times New Roman" w:eastAsia="Times New Roman"/>
                 <w:b w:val="0"/>
                 <w:color w:val="000000"/>
-                <w:sz w:val="19"/>
+                <w:sz w:val="24"/>
               </w:rPr>
               <w:t>0.8466</w:t>
             </w:r>
@@ -1138,6 +1202,7 @@
           <w:tcPr>
             <w:tcW w:type="dxa" w:w="1584"/>
             <w:vAlign w:val="center"/>
+            <w:shd w:val="clear" w:color="auto" w:fill="FFFFFF"/>
             <w:tcBorders>
               <w:top w:val="single" w:sz="8" w:space="0" w:color="000000"/>
               <w:left w:val="single" w:sz="8" w:space="0" w:color="000000"/>
@@ -1147,22 +1212,23 @@
               <w:insideV w:val="single" w:sz="8" w:space="0" w:color="000000"/>
             </w:tcBorders>
             <w:tcMar>
-              <w:top w:w="70" w:type="dxa"/>
-              <w:start w:w="95" w:type="dxa"/>
-              <w:bottom w:w="70" w:type="dxa"/>
-              <w:end w:w="95" w:type="dxa"/>
+              <w:top w:w="90" w:type="dxa"/>
+              <w:start w:w="110" w:type="dxa"/>
+              <w:bottom w:w="90" w:type="dxa"/>
+              <w:end w:w="110" w:type="dxa"/>
             </w:tcMar>
           </w:tcPr>
           <w:p>
             <w:pPr>
+              <w:spacing w:line="360" w:lineRule="auto" w:before="0" w:after="0"/>
               <w:jc w:val="center"/>
             </w:pPr>
             <w:r>
               <w:rPr>
-                <w:rFonts w:ascii="Arial" w:hAnsi="Arial" w:cs="Arial"/>
+                <w:rFonts w:ascii="Times New Roman" w:hAnsi="Times New Roman" w:cs="Times New Roman" w:eastAsia="Times New Roman"/>
                 <w:b w:val="0"/>
                 <w:color w:val="000000"/>
-                <w:sz w:val="19"/>
+                <w:sz w:val="24"/>
               </w:rPr>
               <w:t>0.5857</w:t>
             </w:r>
@@ -1172,6 +1238,7 @@
           <w:tcPr>
             <w:tcW w:type="dxa" w:w="1584"/>
             <w:vAlign w:val="center"/>
+            <w:shd w:val="clear" w:color="auto" w:fill="FFFFFF"/>
             <w:tcBorders>
               <w:top w:val="single" w:sz="8" w:space="0" w:color="000000"/>
               <w:left w:val="single" w:sz="8" w:space="0" w:color="000000"/>
@@ -1181,22 +1248,23 @@
               <w:insideV w:val="single" w:sz="8" w:space="0" w:color="000000"/>
             </w:tcBorders>
             <w:tcMar>
-              <w:top w:w="70" w:type="dxa"/>
-              <w:start w:w="95" w:type="dxa"/>
-              <w:bottom w:w="70" w:type="dxa"/>
-              <w:end w:w="95" w:type="dxa"/>
+              <w:top w:w="90" w:type="dxa"/>
+              <w:start w:w="110" w:type="dxa"/>
+              <w:bottom w:w="90" w:type="dxa"/>
+              <w:end w:w="110" w:type="dxa"/>
             </w:tcMar>
           </w:tcPr>
           <w:p>
             <w:pPr>
+              <w:spacing w:line="360" w:lineRule="auto" w:before="0" w:after="0"/>
               <w:jc w:val="center"/>
             </w:pPr>
             <w:r>
               <w:rPr>
-                <w:rFonts w:ascii="Arial" w:hAnsi="Arial" w:cs="Arial"/>
+                <w:rFonts w:ascii="Times New Roman" w:hAnsi="Times New Roman" w:cs="Times New Roman" w:eastAsia="Times New Roman"/>
                 <w:b w:val="0"/>
                 <w:color w:val="000000"/>
-                <w:sz w:val="19"/>
+                <w:sz w:val="24"/>
               </w:rPr>
               <w:t>0.5160</w:t>
             </w:r>
@@ -1206,19 +1274,21 @@
     </w:tbl>
     <w:p>
       <w:pPr>
-        <w:spacing w:after="20"/>
+        <w:spacing w:line="360" w:lineRule="auto" w:before="0" w:after="0"/>
+        <w:jc w:val="left"/>
       </w:pPr>
     </w:p>
     <w:p>
       <w:pPr>
-        <w:spacing w:after="120" w:line="264" w:lineRule="auto"/>
+        <w:spacing w:line="360" w:lineRule="auto" w:before="0" w:after="120"/>
+        <w:jc w:val="left"/>
       </w:pPr>
       <w:r>
         <w:rPr>
-          <w:rFonts w:ascii="Arial" w:hAnsi="Arial" w:cs="Arial"/>
+          <w:rFonts w:ascii="Times New Roman" w:hAnsi="Times New Roman" w:cs="Times New Roman" w:eastAsia="Times New Roman"/>
           <w:b w:val="0"/>
           <w:color w:val="000000"/>
-          <w:sz w:val="21"/>
+          <w:sz w:val="24"/>
         </w:rPr>
         <w:t>CatBoost показал лучший ROC-AUC, а Logistic Regression - лучший F1.</w:t>
       </w:r>
@@ -1226,16 +1296,17 @@
     <w:p>
       <w:pPr>
         <w:keepNext/>
-        <w:spacing w:before="200" w:after="80"/>
+        <w:spacing w:line="360" w:lineRule="auto" w:before="200" w:after="60"/>
+        <w:jc w:val="left"/>
       </w:pPr>
       <w:r>
         <w:rPr>
-          <w:rFonts w:ascii="Arial" w:hAnsi="Arial" w:cs="Arial"/>
+          <w:rFonts w:ascii="Times New Roman" w:hAnsi="Times New Roman" w:cs="Times New Roman" w:eastAsia="Times New Roman"/>
           <w:b/>
           <w:color w:val="000000"/>
-          <w:sz w:val="26"/>
+          <w:sz w:val="24"/>
         </w:rPr>
-        <w:t>SMOTE</w:t>
+        <w:t>Результат применения SMOTE</w:t>
       </w:r>
     </w:p>
     <w:tbl>
@@ -1259,6 +1330,7 @@
           <w:tcPr>
             <w:tcW w:type="dxa" w:w="3888"/>
             <w:vAlign w:val="center"/>
+            <w:shd w:val="clear" w:color="auto" w:fill="FFFFFF"/>
             <w:tcBorders>
               <w:top w:val="single" w:sz="8" w:space="0" w:color="000000"/>
               <w:left w:val="single" w:sz="8" w:space="0" w:color="000000"/>
@@ -1268,22 +1340,23 @@
               <w:insideV w:val="single" w:sz="8" w:space="0" w:color="000000"/>
             </w:tcBorders>
             <w:tcMar>
-              <w:top w:w="70" w:type="dxa"/>
-              <w:start w:w="95" w:type="dxa"/>
-              <w:bottom w:w="70" w:type="dxa"/>
-              <w:end w:w="95" w:type="dxa"/>
+              <w:top w:w="90" w:type="dxa"/>
+              <w:start w:w="110" w:type="dxa"/>
+              <w:bottom w:w="90" w:type="dxa"/>
+              <w:end w:w="110" w:type="dxa"/>
             </w:tcMar>
           </w:tcPr>
           <w:p>
             <w:pPr>
+              <w:spacing w:line="360" w:lineRule="auto" w:before="0" w:after="0"/>
               <w:jc w:val="center"/>
             </w:pPr>
             <w:r>
               <w:rPr>
-                <w:rFonts w:ascii="Arial" w:hAnsi="Arial" w:cs="Arial"/>
+                <w:rFonts w:ascii="Times New Roman" w:hAnsi="Times New Roman" w:cs="Times New Roman" w:eastAsia="Times New Roman"/>
                 <w:b/>
                 <w:color w:val="000000"/>
-                <w:sz w:val="19"/>
+                <w:sz w:val="24"/>
               </w:rPr>
               <w:t>Вариант</w:t>
             </w:r>
@@ -1293,6 +1366,7 @@
           <w:tcPr>
             <w:tcW w:type="dxa" w:w="1584"/>
             <w:vAlign w:val="center"/>
+            <w:shd w:val="clear" w:color="auto" w:fill="FFFFFF"/>
             <w:tcBorders>
               <w:top w:val="single" w:sz="8" w:space="0" w:color="000000"/>
               <w:left w:val="single" w:sz="8" w:space="0" w:color="000000"/>
@@ -1302,22 +1376,23 @@
               <w:insideV w:val="single" w:sz="8" w:space="0" w:color="000000"/>
             </w:tcBorders>
             <w:tcMar>
-              <w:top w:w="70" w:type="dxa"/>
-              <w:start w:w="95" w:type="dxa"/>
-              <w:bottom w:w="70" w:type="dxa"/>
-              <w:end w:w="95" w:type="dxa"/>
+              <w:top w:w="90" w:type="dxa"/>
+              <w:start w:w="110" w:type="dxa"/>
+              <w:bottom w:w="90" w:type="dxa"/>
+              <w:end w:w="110" w:type="dxa"/>
             </w:tcMar>
           </w:tcPr>
           <w:p>
             <w:pPr>
+              <w:spacing w:line="360" w:lineRule="auto" w:before="0" w:after="0"/>
               <w:jc w:val="center"/>
             </w:pPr>
             <w:r>
               <w:rPr>
-                <w:rFonts w:ascii="Arial" w:hAnsi="Arial" w:cs="Arial"/>
+                <w:rFonts w:ascii="Times New Roman" w:hAnsi="Times New Roman" w:cs="Times New Roman" w:eastAsia="Times New Roman"/>
                 <w:b/>
                 <w:color w:val="000000"/>
-                <w:sz w:val="19"/>
+                <w:sz w:val="24"/>
               </w:rPr>
               <w:t>ROC-AUC</w:t>
             </w:r>
@@ -1327,6 +1402,7 @@
           <w:tcPr>
             <w:tcW w:type="dxa" w:w="1584"/>
             <w:vAlign w:val="center"/>
+            <w:shd w:val="clear" w:color="auto" w:fill="FFFFFF"/>
             <w:tcBorders>
               <w:top w:val="single" w:sz="8" w:space="0" w:color="000000"/>
               <w:left w:val="single" w:sz="8" w:space="0" w:color="000000"/>
@@ -1336,22 +1412,23 @@
               <w:insideV w:val="single" w:sz="8" w:space="0" w:color="000000"/>
             </w:tcBorders>
             <w:tcMar>
-              <w:top w:w="70" w:type="dxa"/>
-              <w:start w:w="95" w:type="dxa"/>
-              <w:bottom w:w="70" w:type="dxa"/>
-              <w:end w:w="95" w:type="dxa"/>
+              <w:top w:w="90" w:type="dxa"/>
+              <w:start w:w="110" w:type="dxa"/>
+              <w:bottom w:w="90" w:type="dxa"/>
+              <w:end w:w="110" w:type="dxa"/>
             </w:tcMar>
           </w:tcPr>
           <w:p>
             <w:pPr>
+              <w:spacing w:line="360" w:lineRule="auto" w:before="0" w:after="0"/>
               <w:jc w:val="center"/>
             </w:pPr>
             <w:r>
               <w:rPr>
-                <w:rFonts w:ascii="Arial" w:hAnsi="Arial" w:cs="Arial"/>
+                <w:rFonts w:ascii="Times New Roman" w:hAnsi="Times New Roman" w:cs="Times New Roman" w:eastAsia="Times New Roman"/>
                 <w:b/>
                 <w:color w:val="000000"/>
-                <w:sz w:val="19"/>
+                <w:sz w:val="24"/>
               </w:rPr>
               <w:t>F1</w:t>
             </w:r>
@@ -1361,6 +1438,7 @@
           <w:tcPr>
             <w:tcW w:type="dxa" w:w="1584"/>
             <w:vAlign w:val="center"/>
+            <w:shd w:val="clear" w:color="auto" w:fill="FFFFFF"/>
             <w:tcBorders>
               <w:top w:val="single" w:sz="8" w:space="0" w:color="000000"/>
               <w:left w:val="single" w:sz="8" w:space="0" w:color="000000"/>
@@ -1370,22 +1448,23 @@
               <w:insideV w:val="single" w:sz="8" w:space="0" w:color="000000"/>
             </w:tcBorders>
             <w:tcMar>
-              <w:top w:w="70" w:type="dxa"/>
-              <w:start w:w="95" w:type="dxa"/>
-              <w:bottom w:w="70" w:type="dxa"/>
-              <w:end w:w="95" w:type="dxa"/>
+              <w:top w:w="90" w:type="dxa"/>
+              <w:start w:w="110" w:type="dxa"/>
+              <w:bottom w:w="90" w:type="dxa"/>
+              <w:end w:w="110" w:type="dxa"/>
             </w:tcMar>
           </w:tcPr>
           <w:p>
             <w:pPr>
+              <w:spacing w:line="360" w:lineRule="auto" w:before="0" w:after="0"/>
               <w:jc w:val="center"/>
             </w:pPr>
             <w:r>
               <w:rPr>
-                <w:rFonts w:ascii="Arial" w:hAnsi="Arial" w:cs="Arial"/>
+                <w:rFonts w:ascii="Times New Roman" w:hAnsi="Times New Roman" w:cs="Times New Roman" w:eastAsia="Times New Roman"/>
                 <w:b/>
                 <w:color w:val="000000"/>
-                <w:sz w:val="19"/>
+                <w:sz w:val="24"/>
               </w:rPr>
               <w:t>Recall</w:t>
             </w:r>
@@ -1397,6 +1476,7 @@
           <w:tcPr>
             <w:tcW w:type="dxa" w:w="3888"/>
             <w:vAlign w:val="center"/>
+            <w:shd w:val="clear" w:color="auto" w:fill="FFFFFF"/>
             <w:tcBorders>
               <w:top w:val="single" w:sz="8" w:space="0" w:color="000000"/>
               <w:left w:val="single" w:sz="8" w:space="0" w:color="000000"/>
@@ -1406,22 +1486,23 @@
               <w:insideV w:val="single" w:sz="8" w:space="0" w:color="000000"/>
             </w:tcBorders>
             <w:tcMar>
-              <w:top w:w="70" w:type="dxa"/>
-              <w:start w:w="95" w:type="dxa"/>
-              <w:bottom w:w="70" w:type="dxa"/>
-              <w:end w:w="95" w:type="dxa"/>
+              <w:top w:w="90" w:type="dxa"/>
+              <w:start w:w="110" w:type="dxa"/>
+              <w:bottom w:w="90" w:type="dxa"/>
+              <w:end w:w="110" w:type="dxa"/>
             </w:tcMar>
           </w:tcPr>
           <w:p>
             <w:pPr>
+              <w:spacing w:line="360" w:lineRule="auto" w:before="0" w:after="0"/>
               <w:jc w:val="left"/>
             </w:pPr>
             <w:r>
               <w:rPr>
-                <w:rFonts w:ascii="Arial" w:hAnsi="Arial" w:cs="Arial"/>
+                <w:rFonts w:ascii="Times New Roman" w:hAnsi="Times New Roman" w:cs="Times New Roman" w:eastAsia="Times New Roman"/>
                 <w:b w:val="0"/>
                 <w:color w:val="000000"/>
-                <w:sz w:val="19"/>
+                <w:sz w:val="24"/>
               </w:rPr>
               <w:t>CatBoost без SMOTE</w:t>
             </w:r>
@@ -1431,6 +1512,7 @@
           <w:tcPr>
             <w:tcW w:type="dxa" w:w="1584"/>
             <w:vAlign w:val="center"/>
+            <w:shd w:val="clear" w:color="auto" w:fill="FFFFFF"/>
             <w:tcBorders>
               <w:top w:val="single" w:sz="8" w:space="0" w:color="000000"/>
               <w:left w:val="single" w:sz="8" w:space="0" w:color="000000"/>
@@ -1440,22 +1522,23 @@
               <w:insideV w:val="single" w:sz="8" w:space="0" w:color="000000"/>
             </w:tcBorders>
             <w:tcMar>
-              <w:top w:w="70" w:type="dxa"/>
-              <w:start w:w="95" w:type="dxa"/>
-              <w:bottom w:w="70" w:type="dxa"/>
-              <w:end w:w="95" w:type="dxa"/>
+              <w:top w:w="90" w:type="dxa"/>
+              <w:start w:w="110" w:type="dxa"/>
+              <w:bottom w:w="90" w:type="dxa"/>
+              <w:end w:w="110" w:type="dxa"/>
             </w:tcMar>
           </w:tcPr>
           <w:p>
             <w:pPr>
+              <w:spacing w:line="360" w:lineRule="auto" w:before="0" w:after="0"/>
               <w:jc w:val="center"/>
             </w:pPr>
             <w:r>
               <w:rPr>
-                <w:rFonts w:ascii="Arial" w:hAnsi="Arial" w:cs="Arial"/>
+                <w:rFonts w:ascii="Times New Roman" w:hAnsi="Times New Roman" w:cs="Times New Roman" w:eastAsia="Times New Roman"/>
                 <w:b w:val="0"/>
                 <w:color w:val="000000"/>
-                <w:sz w:val="19"/>
+                <w:sz w:val="24"/>
               </w:rPr>
               <w:t>0.8466</w:t>
             </w:r>
@@ -1465,6 +1548,7 @@
           <w:tcPr>
             <w:tcW w:type="dxa" w:w="1584"/>
             <w:vAlign w:val="center"/>
+            <w:shd w:val="clear" w:color="auto" w:fill="FFFFFF"/>
             <w:tcBorders>
               <w:top w:val="single" w:sz="8" w:space="0" w:color="000000"/>
               <w:left w:val="single" w:sz="8" w:space="0" w:color="000000"/>
@@ -1474,22 +1558,23 @@
               <w:insideV w:val="single" w:sz="8" w:space="0" w:color="000000"/>
             </w:tcBorders>
             <w:tcMar>
-              <w:top w:w="70" w:type="dxa"/>
-              <w:start w:w="95" w:type="dxa"/>
-              <w:bottom w:w="70" w:type="dxa"/>
-              <w:end w:w="95" w:type="dxa"/>
+              <w:top w:w="90" w:type="dxa"/>
+              <w:start w:w="110" w:type="dxa"/>
+              <w:bottom w:w="90" w:type="dxa"/>
+              <w:end w:w="110" w:type="dxa"/>
             </w:tcMar>
           </w:tcPr>
           <w:p>
             <w:pPr>
+              <w:spacing w:line="360" w:lineRule="auto" w:before="0" w:after="0"/>
               <w:jc w:val="center"/>
             </w:pPr>
             <w:r>
               <w:rPr>
-                <w:rFonts w:ascii="Arial" w:hAnsi="Arial" w:cs="Arial"/>
+                <w:rFonts w:ascii="Times New Roman" w:hAnsi="Times New Roman" w:cs="Times New Roman" w:eastAsia="Times New Roman"/>
                 <w:b w:val="0"/>
                 <w:color w:val="000000"/>
-                <w:sz w:val="19"/>
+                <w:sz w:val="24"/>
               </w:rPr>
               <w:t>0.5857</w:t>
             </w:r>
@@ -1499,6 +1584,7 @@
           <w:tcPr>
             <w:tcW w:type="dxa" w:w="1584"/>
             <w:vAlign w:val="center"/>
+            <w:shd w:val="clear" w:color="auto" w:fill="FFFFFF"/>
             <w:tcBorders>
               <w:top w:val="single" w:sz="8" w:space="0" w:color="000000"/>
               <w:left w:val="single" w:sz="8" w:space="0" w:color="000000"/>
@@ -1508,22 +1594,23 @@
               <w:insideV w:val="single" w:sz="8" w:space="0" w:color="000000"/>
             </w:tcBorders>
             <w:tcMar>
-              <w:top w:w="70" w:type="dxa"/>
-              <w:start w:w="95" w:type="dxa"/>
-              <w:bottom w:w="70" w:type="dxa"/>
-              <w:end w:w="95" w:type="dxa"/>
+              <w:top w:w="90" w:type="dxa"/>
+              <w:start w:w="110" w:type="dxa"/>
+              <w:bottom w:w="90" w:type="dxa"/>
+              <w:end w:w="110" w:type="dxa"/>
             </w:tcMar>
           </w:tcPr>
           <w:p>
             <w:pPr>
+              <w:spacing w:line="360" w:lineRule="auto" w:before="0" w:after="0"/>
               <w:jc w:val="center"/>
             </w:pPr>
             <w:r>
               <w:rPr>
-                <w:rFonts w:ascii="Arial" w:hAnsi="Arial" w:cs="Arial"/>
+                <w:rFonts w:ascii="Times New Roman" w:hAnsi="Times New Roman" w:cs="Times New Roman" w:eastAsia="Times New Roman"/>
                 <w:b w:val="0"/>
                 <w:color w:val="000000"/>
-                <w:sz w:val="19"/>
+                <w:sz w:val="24"/>
               </w:rPr>
               <w:t>0.5160</w:t>
             </w:r>
@@ -1535,6 +1622,7 @@
           <w:tcPr>
             <w:tcW w:type="dxa" w:w="3888"/>
             <w:vAlign w:val="center"/>
+            <w:shd w:val="clear" w:color="auto" w:fill="FFFFFF"/>
             <w:tcBorders>
               <w:top w:val="single" w:sz="8" w:space="0" w:color="000000"/>
               <w:left w:val="single" w:sz="8" w:space="0" w:color="000000"/>
@@ -1544,22 +1632,23 @@
               <w:insideV w:val="single" w:sz="8" w:space="0" w:color="000000"/>
             </w:tcBorders>
             <w:tcMar>
-              <w:top w:w="70" w:type="dxa"/>
-              <w:start w:w="95" w:type="dxa"/>
-              <w:bottom w:w="70" w:type="dxa"/>
-              <w:end w:w="95" w:type="dxa"/>
+              <w:top w:w="90" w:type="dxa"/>
+              <w:start w:w="110" w:type="dxa"/>
+              <w:bottom w:w="90" w:type="dxa"/>
+              <w:end w:w="110" w:type="dxa"/>
             </w:tcMar>
           </w:tcPr>
           <w:p>
             <w:pPr>
+              <w:spacing w:line="360" w:lineRule="auto" w:before="0" w:after="0"/>
               <w:jc w:val="left"/>
             </w:pPr>
             <w:r>
               <w:rPr>
-                <w:rFonts w:ascii="Arial" w:hAnsi="Arial" w:cs="Arial"/>
+                <w:rFonts w:ascii="Times New Roman" w:hAnsi="Times New Roman" w:cs="Times New Roman" w:eastAsia="Times New Roman"/>
                 <w:b w:val="0"/>
                 <w:color w:val="000000"/>
-                <w:sz w:val="19"/>
+                <w:sz w:val="24"/>
               </w:rPr>
               <w:t>CatBoost с SMOTE</w:t>
             </w:r>
@@ -1569,6 +1658,7 @@
           <w:tcPr>
             <w:tcW w:type="dxa" w:w="1584"/>
             <w:vAlign w:val="center"/>
+            <w:shd w:val="clear" w:color="auto" w:fill="FFFFFF"/>
             <w:tcBorders>
               <w:top w:val="single" w:sz="8" w:space="0" w:color="000000"/>
               <w:left w:val="single" w:sz="8" w:space="0" w:color="000000"/>
@@ -1578,22 +1668,23 @@
               <w:insideV w:val="single" w:sz="8" w:space="0" w:color="000000"/>
             </w:tcBorders>
             <w:tcMar>
-              <w:top w:w="70" w:type="dxa"/>
-              <w:start w:w="95" w:type="dxa"/>
-              <w:bottom w:w="70" w:type="dxa"/>
-              <w:end w:w="95" w:type="dxa"/>
+              <w:top w:w="90" w:type="dxa"/>
+              <w:start w:w="110" w:type="dxa"/>
+              <w:bottom w:w="90" w:type="dxa"/>
+              <w:end w:w="110" w:type="dxa"/>
             </w:tcMar>
           </w:tcPr>
           <w:p>
             <w:pPr>
+              <w:spacing w:line="360" w:lineRule="auto" w:before="0" w:after="0"/>
               <w:jc w:val="center"/>
             </w:pPr>
             <w:r>
               <w:rPr>
-                <w:rFonts w:ascii="Arial" w:hAnsi="Arial" w:cs="Arial"/>
+                <w:rFonts w:ascii="Times New Roman" w:hAnsi="Times New Roman" w:cs="Times New Roman" w:eastAsia="Times New Roman"/>
                 <w:b w:val="0"/>
                 <w:color w:val="000000"/>
-                <w:sz w:val="19"/>
+                <w:sz w:val="24"/>
               </w:rPr>
               <w:t>0.8416</w:t>
             </w:r>
@@ -1603,6 +1694,7 @@
           <w:tcPr>
             <w:tcW w:type="dxa" w:w="1584"/>
             <w:vAlign w:val="center"/>
+            <w:shd w:val="clear" w:color="auto" w:fill="FFFFFF"/>
             <w:tcBorders>
               <w:top w:val="single" w:sz="8" w:space="0" w:color="000000"/>
               <w:left w:val="single" w:sz="8" w:space="0" w:color="000000"/>
@@ -1612,22 +1704,23 @@
               <w:insideV w:val="single" w:sz="8" w:space="0" w:color="000000"/>
             </w:tcBorders>
             <w:tcMar>
-              <w:top w:w="70" w:type="dxa"/>
-              <w:start w:w="95" w:type="dxa"/>
-              <w:bottom w:w="70" w:type="dxa"/>
-              <w:end w:w="95" w:type="dxa"/>
+              <w:top w:w="90" w:type="dxa"/>
+              <w:start w:w="110" w:type="dxa"/>
+              <w:bottom w:w="90" w:type="dxa"/>
+              <w:end w:w="110" w:type="dxa"/>
             </w:tcMar>
           </w:tcPr>
           <w:p>
             <w:pPr>
+              <w:spacing w:line="360" w:lineRule="auto" w:before="0" w:after="0"/>
               <w:jc w:val="center"/>
             </w:pPr>
             <w:r>
               <w:rPr>
-                <w:rFonts w:ascii="Arial" w:hAnsi="Arial" w:cs="Arial"/>
+                <w:rFonts w:ascii="Times New Roman" w:hAnsi="Times New Roman" w:cs="Times New Roman" w:eastAsia="Times New Roman"/>
                 <w:b w:val="0"/>
                 <w:color w:val="000000"/>
-                <w:sz w:val="19"/>
+                <w:sz w:val="24"/>
               </w:rPr>
               <w:t>0.6284</w:t>
             </w:r>
@@ -1637,6 +1730,7 @@
           <w:tcPr>
             <w:tcW w:type="dxa" w:w="1584"/>
             <w:vAlign w:val="center"/>
+            <w:shd w:val="clear" w:color="auto" w:fill="FFFFFF"/>
             <w:tcBorders>
               <w:top w:val="single" w:sz="8" w:space="0" w:color="000000"/>
               <w:left w:val="single" w:sz="8" w:space="0" w:color="000000"/>
@@ -1646,22 +1740,23 @@
               <w:insideV w:val="single" w:sz="8" w:space="0" w:color="000000"/>
             </w:tcBorders>
             <w:tcMar>
-              <w:top w:w="70" w:type="dxa"/>
-              <w:start w:w="95" w:type="dxa"/>
-              <w:bottom w:w="70" w:type="dxa"/>
-              <w:end w:w="95" w:type="dxa"/>
+              <w:top w:w="90" w:type="dxa"/>
+              <w:start w:w="110" w:type="dxa"/>
+              <w:bottom w:w="90" w:type="dxa"/>
+              <w:end w:w="110" w:type="dxa"/>
             </w:tcMar>
           </w:tcPr>
           <w:p>
             <w:pPr>
+              <w:spacing w:line="360" w:lineRule="auto" w:before="0" w:after="0"/>
               <w:jc w:val="center"/>
             </w:pPr>
             <w:r>
               <w:rPr>
-                <w:rFonts w:ascii="Arial" w:hAnsi="Arial" w:cs="Arial"/>
+                <w:rFonts w:ascii="Times New Roman" w:hAnsi="Times New Roman" w:cs="Times New Roman" w:eastAsia="Times New Roman"/>
                 <w:b w:val="0"/>
                 <w:color w:val="000000"/>
-                <w:sz w:val="19"/>
+                <w:sz w:val="24"/>
               </w:rPr>
               <w:t>0.7166</w:t>
             </w:r>
@@ -1671,19 +1766,21 @@
     </w:tbl>
     <w:p>
       <w:pPr>
-        <w:spacing w:after="20"/>
+        <w:spacing w:line="360" w:lineRule="auto" w:before="0" w:after="0"/>
+        <w:jc w:val="left"/>
       </w:pPr>
     </w:p>
     <w:p>
       <w:pPr>
-        <w:spacing w:after="120" w:line="264" w:lineRule="auto"/>
+        <w:spacing w:line="360" w:lineRule="auto" w:before="0" w:after="120"/>
+        <w:jc w:val="left"/>
       </w:pPr>
       <w:r>
         <w:rPr>
-          <w:rFonts w:ascii="Arial" w:hAnsi="Arial" w:cs="Arial"/>
+          <w:rFonts w:ascii="Times New Roman" w:hAnsi="Times New Roman" w:cs="Times New Roman" w:eastAsia="Times New Roman"/>
           <w:b w:val="0"/>
           <w:color w:val="000000"/>
-          <w:sz w:val="21"/>
+          <w:sz w:val="24"/>
         </w:rPr>
         <w:t>SMOTE увеличил Recall на 0.2005: модель стала находить больше клиентов с риском ухода.</w:t>
       </w:r>
@@ -1691,27 +1788,28 @@
     <w:p>
       <w:pPr>
         <w:keepNext/>
-        <w:spacing w:before="200" w:after="80"/>
+        <w:spacing w:line="360" w:lineRule="auto" w:before="200" w:after="60"/>
+        <w:jc w:val="left"/>
       </w:pPr>
       <w:r>
         <w:rPr>
-          <w:rFonts w:ascii="Arial" w:hAnsi="Arial" w:cs="Arial"/>
+          <w:rFonts w:ascii="Times New Roman" w:hAnsi="Times New Roman" w:cs="Times New Roman" w:eastAsia="Times New Roman"/>
           <w:b/>
           <w:color w:val="000000"/>
-          <w:sz w:val="26"/>
+          <w:sz w:val="24"/>
         </w:rPr>
         <w:t>Важность признаков</w:t>
       </w:r>
     </w:p>
     <w:p>
       <w:pPr>
-        <w:spacing w:after="40"/>
+        <w:spacing w:line="360" w:lineRule="auto" w:before="0" w:after="40"/>
         <w:jc w:val="center"/>
       </w:pPr>
       <w:r>
         <w:drawing>
           <wp:inline xmlns:a="http://schemas.openxmlformats.org/drawingml/2006/main" xmlns:pic="http://schemas.openxmlformats.org/drawingml/2006/picture">
-            <wp:extent cx="5303520" cy="3503683"/>
+            <wp:extent cx="5394960" cy="3356864"/>
             <wp:docPr id="1" name="Picture 1"/>
             <wp:cNvGraphicFramePr>
               <a:graphicFrameLocks noChangeAspect="1"/>
@@ -1720,7 +1818,7 @@
               <a:graphicData uri="http://schemas.openxmlformats.org/drawingml/2006/picture">
                 <pic:pic>
                   <pic:nvPicPr>
-                    <pic:cNvPr id="0" name="feature_importance_catboost.png"/>
+                    <pic:cNvPr id="0" name="feature_importance_black_white.png"/>
                     <pic:cNvPicPr/>
                   </pic:nvPicPr>
                   <pic:blipFill>
@@ -1732,7 +1830,7 @@
                   <pic:spPr>
                     <a:xfrm>
                       <a:off x="0" y="0"/>
-                      <a:ext cx="5303520" cy="3503683"/>
+                      <a:ext cx="5394960" cy="3356864"/>
                     </a:xfrm>
                     <a:prstGeom prst="rect"/>
                   </pic:spPr>
@@ -1745,31 +1843,32 @@
     </w:p>
     <w:p>
       <w:pPr>
-        <w:spacing w:after="100"/>
+        <w:spacing w:line="360" w:lineRule="auto" w:before="0" w:after="100"/>
         <w:jc w:val="center"/>
       </w:pPr>
       <w:r>
         <w:rPr>
-          <w:rFonts w:ascii="Arial" w:hAnsi="Arial" w:cs="Arial"/>
+          <w:rFonts w:ascii="Times New Roman" w:hAnsi="Times New Roman" w:cs="Times New Roman" w:eastAsia="Times New Roman"/>
           <w:b w:val="0"/>
           <w:color w:val="000000"/>
-          <w:sz w:val="19"/>
+          <w:sz w:val="24"/>
         </w:rPr>
-        <w:t>Топ 15 признаков по важности CatBoost</w:t>
+        <w:t>Топ 10 признаков по важности CatBoost</w:t>
       </w:r>
     </w:p>
     <w:p>
       <w:pPr>
-        <w:spacing w:after="120" w:line="264" w:lineRule="auto"/>
+        <w:spacing w:line="360" w:lineRule="auto" w:before="0" w:after="120"/>
+        <w:jc w:val="left"/>
       </w:pPr>
       <w:r>
         <w:rPr>
-          <w:rFonts w:ascii="Arial" w:hAnsi="Arial" w:cs="Arial"/>
+          <w:rFonts w:ascii="Times New Roman" w:hAnsi="Times New Roman" w:cs="Times New Roman" w:eastAsia="Times New Roman"/>
           <w:b w:val="0"/>
           <w:color w:val="000000"/>
-          <w:sz w:val="21"/>
+          <w:sz w:val="24"/>
         </w:rPr>
-        <w:t>Главные признаки: помесячный договор, срок обслуживания и ежемесячная плата. Для удержания клиентов полезен вариант CatBoost со SMOTE, если важнее не пропускать отток.</w:t>
+        <w:t>Главные признаки: помесячный договор, срок обслуживания и ежемесячная плата. Если важнее не пропускать отток, предпочтителен вариант CatBoost со SMOTE.</w:t>
       </w:r>
     </w:p>
     <w:sectPr>
@@ -2145,6 +2244,15 @@
     <w:name w:val="Normal"/>
     <w:qFormat/>
     <w:rsid w:val="00FC693F"/>
+    <w:pPr>
+      <w:spacing w:line="360" w:lineRule="auto" w:before="0" w:after="0"/>
+    </w:pPr>
+    <w:rPr>
+      <w:rFonts w:ascii="Times New Roman" w:hAnsi="Times New Roman"/>
+      <w:b w:val="0"/>
+      <w:color w:val="000000"/>
+      <w:sz w:val="24"/>
+    </w:rPr>
   </w:style>
   <w:style w:type="paragraph" w:styleId="Header">
     <w:name w:val="header"/>
@@ -2201,15 +2309,15 @@
     <w:pPr>
       <w:keepNext/>
       <w:keepLines/>
-      <w:spacing w:before="480" w:after="0"/>
+      <w:spacing w:before="0" w:after="0" w:line="360" w:lineRule="auto"/>
       <w:outlineLvl w:val="0"/>
     </w:pPr>
     <w:rPr>
-      <w:rFonts w:asciiTheme="majorHAnsi" w:eastAsiaTheme="majorEastAsia" w:hAnsiTheme="majorHAnsi" w:cstheme="majorBidi"/>
-      <w:b/>
+      <w:rFonts w:asciiTheme="majorHAnsi" w:eastAsiaTheme="majorEastAsia" w:hAnsiTheme="majorHAnsi" w:cstheme="majorBidi" w:ascii="Times New Roman" w:hAnsi="Times New Roman"/>
+      <w:b w:val="0"/>
       <w:bCs/>
-      <w:color w:val="365F91" w:themeColor="accent1" w:themeShade="BF"/>
-      <w:sz w:val="28"/>
+      <w:color w:val="000000"/>
+      <w:sz w:val="24"/>
       <w:szCs w:val="28"/>
     </w:rPr>
   </w:style>
@@ -2225,15 +2333,15 @@
     <w:pPr>
       <w:keepNext/>
       <w:keepLines/>
-      <w:spacing w:before="200" w:after="0"/>
+      <w:spacing w:before="0" w:after="0" w:line="360" w:lineRule="auto"/>
       <w:outlineLvl w:val="1"/>
     </w:pPr>
     <w:rPr>
-      <w:rFonts w:asciiTheme="majorHAnsi" w:eastAsiaTheme="majorEastAsia" w:hAnsiTheme="majorHAnsi" w:cstheme="majorBidi"/>
-      <w:b/>
+      <w:rFonts w:asciiTheme="majorHAnsi" w:eastAsiaTheme="majorEastAsia" w:hAnsiTheme="majorHAnsi" w:cstheme="majorBidi" w:ascii="Times New Roman" w:hAnsi="Times New Roman"/>
+      <w:b w:val="0"/>
       <w:bCs/>
-      <w:color w:val="4F81BD" w:themeColor="accent1"/>
-      <w:sz w:val="26"/>
+      <w:color w:val="000000"/>
+      <w:sz w:val="24"/>
       <w:szCs w:val="26"/>
     </w:rPr>
   </w:style>
@@ -2490,15 +2598,16 @@
       <w:pBdr>
         <w:bottom w:val="single" w:sz="8" w:space="4" w:color="4F81BD" w:themeColor="accent1"/>
       </w:pBdr>
-      <w:spacing w:after="300" w:line="240" w:lineRule="auto"/>
+      <w:spacing w:after="0" w:line="360" w:lineRule="auto" w:before="0"/>
       <w:contextualSpacing/>
     </w:pPr>
     <w:rPr>
-      <w:rFonts w:asciiTheme="majorHAnsi" w:eastAsiaTheme="majorEastAsia" w:hAnsiTheme="majorHAnsi" w:cstheme="majorBidi"/>
-      <w:color w:val="17365D" w:themeColor="text2" w:themeShade="BF"/>
+      <w:rFonts w:asciiTheme="majorHAnsi" w:eastAsiaTheme="majorEastAsia" w:hAnsiTheme="majorHAnsi" w:cstheme="majorBidi" w:ascii="Times New Roman" w:hAnsi="Times New Roman"/>
+      <w:b w:val="0"/>
+      <w:color w:val="000000"/>
       <w:spacing w:val="5"/>
       <w:kern w:val="28"/>
-      <w:sz w:val="52"/>
+      <w:sz w:val="24"/>
       <w:szCs w:val="52"/>
     </w:rPr>
   </w:style>

</xml_diff>